<commit_message>
test(corpus): tell the rule documents' readings apart, and tie their cases to their labels
From the independent review of #137:
- E-default-paragraph-style: Normal is no longer marked w:default, and the first
  default style is written before it, so Word's choice tells the first default
  style, the last one and the style named Normal apart;
- E-paragraph-units case 4: left 50 pt, which no plausible character unit times 3
  gives, instead of 36 pt;
- E-list-level-inherit case 8: a direct instance other than the style's, without
  w:ilvl;
- a test ties every case of the three documents to the markup its label names;
- w:pPr, w:numPr, w:lvl and w:style are checked against the schema order;
- the colour mapping check is tested with a mapping attribute's name as a value;
- SOURCES.md lists the documents in the generator's order again.

Co-Authored-By: Claude Opus 5.5 <noreply@anthropic.com>
</commit_message>
<xml_diff>
--- a/tests/corpus/word-rules/E-default-paragraph-style.docx
+++ b/tests/corpus/word-rules/E-default-paragraph-style.docx
@@ -17,15 +17,23 @@
     </w:p>
     <w:p>
       <w:pPr>
-        <w:pStyle w:val="AlsoDefault"/>
+        <w:pStyle w:val="FirstDefault"/>
       </w:pPr>
       <w:r>
-        <w:t xml:space="preserve">Case 03: a paragraph that names AlsoDefault</w:t>
+        <w:t xml:space="preserve">Case 03: a paragraph that names FirstDefault</w:t>
+      </w:r>
+    </w:p>
+    <w:p>
+      <w:pPr>
+        <w:pStyle w:val="LastDefault"/>
+      </w:pPr>
+      <w:r>
+        <w:t xml:space="preserve">Case 04: a paragraph that names LastDefault</w:t>
       </w:r>
     </w:p>
     <w:p>
       <w:r>
-        <w:t xml:space="preserve">Case 04: a paragraph that names no style, after the others</w:t>
+        <w:t xml:space="preserve">Case 05: a paragraph that names no style, after the others</w:t>
       </w:r>
     </w:p>
     <w:sectPr>
@@ -56,7 +64,15 @@
       </w:pPr>
     </w:pPrDefault>
   </w:docDefaults>
-  <w:style w:type="paragraph" w:default="1" w:styleId="Normal">
+  <w:style w:type="paragraph" w:default="1" w:customStyle="1" w:styleId="FirstDefault">
+    <w:name w:val="FirstDefault"/>
+    <w:basedOn w:val="Normal"/>
+    <w:pPr>
+      <w:spacing w:after="240"/>
+      <w:jc w:val="right"/>
+    </w:pPr>
+  </w:style>
+  <w:style w:type="paragraph" w:styleId="Normal">
     <w:name w:val="Normal"/>
     <w:qFormat/>
   </w:style>
@@ -87,8 +103,8 @@
     <w:semiHidden/>
     <w:unhideWhenUsed/>
   </w:style>
-  <w:style w:type="paragraph" w:default="1" w:customStyle="1" w:styleId="AlsoDefault">
-    <w:name w:val="AlsoDefault"/>
+  <w:style w:type="paragraph" w:default="1" w:customStyle="1" w:styleId="LastDefault">
+    <w:name w:val="LastDefault"/>
     <w:basedOn w:val="Normal"/>
     <w:pPr>
       <w:spacing w:after="480"/>

</xml_diff>